<commit_message>
Vervang info@hetjan.org met aansoek@hetjan.org deurgaans
Webblaaie, aansoekvorm (PDF) en terugvoertemplaat (Word) opgedateer.

Co-Authored-By: Claude Fable 5 <noreply@anthropic.com>
</commit_message>
<xml_diff>
--- a/dokumente/HJMF-terugvoerverslag-templaat.docx
+++ b/dokumente/HJMF-terugvoerverslag-templaat.docx
@@ -11,10 +11,10 @@
           <w:noProof/>
         </w:rPr>
         <w:drawing>
-          <wp:inline distT="0" distB="0" distL="0" distR="0" wp14:anchorId="26D1D19A" wp14:editId="138535DF">
+          <wp:inline distT="0" distB="0" distL="0" distR="0" wp14:anchorId="556FEF22" wp14:editId="7FA39DEB">
             <wp:extent cx="1512000" cy="1088278"/>
             <wp:effectExtent l="0" t="0" r="0" b="0"/>
-            <wp:docPr id="1788129017" name="Picture 1"/>
+            <wp:docPr id="597874614" name="Picture 1"/>
             <wp:cNvGraphicFramePr>
               <a:graphicFrameLocks xmlns:a="http://schemas.openxmlformats.org/drawingml/2006/main" noChangeAspect="1"/>
             </wp:cNvGraphicFramePr>
@@ -22,7 +22,7 @@
               <a:graphicData uri="http://schemas.openxmlformats.org/drawingml/2006/picture">
                 <pic:pic xmlns:pic="http://schemas.openxmlformats.org/drawingml/2006/picture">
                   <pic:nvPicPr>
-                    <pic:cNvPr id="1788129017" name=""/>
+                    <pic:cNvPr id="597874614" name=""/>
                     <pic:cNvPicPr/>
                   </pic:nvPicPr>
                   <pic:blipFill>
@@ -683,7 +683,7 @@
         <w:color w:val="5C6F6A"/>
         <w:sz w:val="17"/>
       </w:rPr>
-      <w:t>Het Jan Marais Fonds · info@hetjan.org · Openbare weldaadsorganisasie 930085957</w:t>
+      <w:t>Het Jan Marais Fonds · aansoek@hetjan.org · Openbare weldaadsorganisasie 930085957</w:t>
     </w:r>
   </w:p>
 </w:ftr>
@@ -1165,7 +1165,7 @@
     <w:link w:val="Heading1Char"/>
     <w:uiPriority w:val="9"/>
     <w:qFormat/>
-    <w:rsid w:val="00456B15"/>
+    <w:rsid w:val="00F44AAA"/>
     <w:pPr>
       <w:keepNext/>
       <w:keepLines/>
@@ -1188,7 +1188,7 @@
     <w:semiHidden/>
     <w:unhideWhenUsed/>
     <w:qFormat/>
-    <w:rsid w:val="00456B15"/>
+    <w:rsid w:val="00F44AAA"/>
     <w:pPr>
       <w:keepNext/>
       <w:keepLines/>
@@ -1211,7 +1211,7 @@
     <w:semiHidden/>
     <w:unhideWhenUsed/>
     <w:qFormat/>
-    <w:rsid w:val="00456B15"/>
+    <w:rsid w:val="00F44AAA"/>
     <w:pPr>
       <w:keepNext/>
       <w:keepLines/>
@@ -1234,7 +1234,7 @@
     <w:semiHidden/>
     <w:unhideWhenUsed/>
     <w:qFormat/>
-    <w:rsid w:val="00456B15"/>
+    <w:rsid w:val="00F44AAA"/>
     <w:pPr>
       <w:keepNext/>
       <w:keepLines/>
@@ -1257,7 +1257,7 @@
     <w:semiHidden/>
     <w:unhideWhenUsed/>
     <w:qFormat/>
-    <w:rsid w:val="00456B15"/>
+    <w:rsid w:val="00F44AAA"/>
     <w:pPr>
       <w:keepNext/>
       <w:keepLines/>
@@ -1278,7 +1278,7 @@
     <w:semiHidden/>
     <w:unhideWhenUsed/>
     <w:qFormat/>
-    <w:rsid w:val="00456B15"/>
+    <w:rsid w:val="00F44AAA"/>
     <w:pPr>
       <w:keepNext/>
       <w:keepLines/>
@@ -1301,7 +1301,7 @@
     <w:semiHidden/>
     <w:unhideWhenUsed/>
     <w:qFormat/>
-    <w:rsid w:val="00456B15"/>
+    <w:rsid w:val="00F44AAA"/>
     <w:pPr>
       <w:keepNext/>
       <w:keepLines/>
@@ -1322,7 +1322,7 @@
     <w:semiHidden/>
     <w:unhideWhenUsed/>
     <w:qFormat/>
-    <w:rsid w:val="00456B15"/>
+    <w:rsid w:val="00F44AAA"/>
     <w:pPr>
       <w:keepNext/>
       <w:keepLines/>
@@ -1345,7 +1345,7 @@
     <w:semiHidden/>
     <w:unhideWhenUsed/>
     <w:qFormat/>
-    <w:rsid w:val="00456B15"/>
+    <w:rsid w:val="00F44AAA"/>
     <w:pPr>
       <w:keepNext/>
       <w:keepLines/>
@@ -1389,7 +1389,7 @@
     <w:basedOn w:val="DefaultParagraphFont"/>
     <w:link w:val="Heading1"/>
     <w:uiPriority w:val="9"/>
-    <w:rsid w:val="00456B15"/>
+    <w:rsid w:val="00F44AAA"/>
     <w:rPr>
       <w:rFonts w:asciiTheme="majorHAnsi" w:eastAsiaTheme="majorEastAsia" w:hAnsiTheme="majorHAnsi" w:cstheme="majorBidi"/>
       <w:color w:val="0F4761" w:themeColor="accent1" w:themeShade="BF"/>
@@ -1404,7 +1404,7 @@
     <w:link w:val="Heading2"/>
     <w:uiPriority w:val="9"/>
     <w:semiHidden/>
-    <w:rsid w:val="00456B15"/>
+    <w:rsid w:val="00F44AAA"/>
     <w:rPr>
       <w:rFonts w:asciiTheme="majorHAnsi" w:eastAsiaTheme="majorEastAsia" w:hAnsiTheme="majorHAnsi" w:cstheme="majorBidi"/>
       <w:color w:val="0F4761" w:themeColor="accent1" w:themeShade="BF"/>
@@ -1419,7 +1419,7 @@
     <w:link w:val="Heading3"/>
     <w:uiPriority w:val="9"/>
     <w:semiHidden/>
-    <w:rsid w:val="00456B15"/>
+    <w:rsid w:val="00F44AAA"/>
     <w:rPr>
       <w:rFonts w:eastAsiaTheme="majorEastAsia" w:cstheme="majorBidi"/>
       <w:color w:val="0F4761" w:themeColor="accent1" w:themeShade="BF"/>
@@ -1434,7 +1434,7 @@
     <w:link w:val="Heading4"/>
     <w:uiPriority w:val="9"/>
     <w:semiHidden/>
-    <w:rsid w:val="00456B15"/>
+    <w:rsid w:val="00F44AAA"/>
     <w:rPr>
       <w:rFonts w:eastAsiaTheme="majorEastAsia" w:cstheme="majorBidi"/>
       <w:i/>
@@ -1449,7 +1449,7 @@
     <w:link w:val="Heading5"/>
     <w:uiPriority w:val="9"/>
     <w:semiHidden/>
-    <w:rsid w:val="00456B15"/>
+    <w:rsid w:val="00F44AAA"/>
     <w:rPr>
       <w:rFonts w:eastAsiaTheme="majorEastAsia" w:cstheme="majorBidi"/>
       <w:color w:val="0F4761" w:themeColor="accent1" w:themeShade="BF"/>
@@ -1462,7 +1462,7 @@
     <w:link w:val="Heading6"/>
     <w:uiPriority w:val="9"/>
     <w:semiHidden/>
-    <w:rsid w:val="00456B15"/>
+    <w:rsid w:val="00F44AAA"/>
     <w:rPr>
       <w:rFonts w:eastAsiaTheme="majorEastAsia" w:cstheme="majorBidi"/>
       <w:i/>
@@ -1477,7 +1477,7 @@
     <w:link w:val="Heading7"/>
     <w:uiPriority w:val="9"/>
     <w:semiHidden/>
-    <w:rsid w:val="00456B15"/>
+    <w:rsid w:val="00F44AAA"/>
     <w:rPr>
       <w:rFonts w:eastAsiaTheme="majorEastAsia" w:cstheme="majorBidi"/>
       <w:color w:val="595959" w:themeColor="text1" w:themeTint="A6"/>
@@ -1490,7 +1490,7 @@
     <w:link w:val="Heading8"/>
     <w:uiPriority w:val="9"/>
     <w:semiHidden/>
-    <w:rsid w:val="00456B15"/>
+    <w:rsid w:val="00F44AAA"/>
     <w:rPr>
       <w:rFonts w:eastAsiaTheme="majorEastAsia" w:cstheme="majorBidi"/>
       <w:i/>
@@ -1505,7 +1505,7 @@
     <w:link w:val="Heading9"/>
     <w:uiPriority w:val="9"/>
     <w:semiHidden/>
-    <w:rsid w:val="00456B15"/>
+    <w:rsid w:val="00F44AAA"/>
     <w:rPr>
       <w:rFonts w:eastAsiaTheme="majorEastAsia" w:cstheme="majorBidi"/>
       <w:color w:val="272727" w:themeColor="text1" w:themeTint="D8"/>
@@ -1519,7 +1519,7 @@
     <w:link w:val="TitleChar"/>
     <w:uiPriority w:val="10"/>
     <w:qFormat/>
-    <w:rsid w:val="00456B15"/>
+    <w:rsid w:val="00F44AAA"/>
     <w:pPr>
       <w:spacing w:after="80" w:line="240" w:lineRule="auto"/>
       <w:contextualSpacing/>
@@ -1537,7 +1537,7 @@
     <w:basedOn w:val="DefaultParagraphFont"/>
     <w:link w:val="Title"/>
     <w:uiPriority w:val="10"/>
-    <w:rsid w:val="00456B15"/>
+    <w:rsid w:val="00F44AAA"/>
     <w:rPr>
       <w:rFonts w:asciiTheme="majorHAnsi" w:eastAsiaTheme="majorEastAsia" w:hAnsiTheme="majorHAnsi" w:cstheme="majorBidi"/>
       <w:spacing w:val="-10"/>
@@ -1554,7 +1554,7 @@
     <w:link w:val="SubtitleChar"/>
     <w:uiPriority w:val="11"/>
     <w:qFormat/>
-    <w:rsid w:val="00456B15"/>
+    <w:rsid w:val="00F44AAA"/>
     <w:pPr>
       <w:numPr>
         <w:ilvl w:val="1"/>
@@ -1573,7 +1573,7 @@
     <w:basedOn w:val="DefaultParagraphFont"/>
     <w:link w:val="Subtitle"/>
     <w:uiPriority w:val="11"/>
-    <w:rsid w:val="00456B15"/>
+    <w:rsid w:val="00F44AAA"/>
     <w:rPr>
       <w:rFonts w:eastAsiaTheme="majorEastAsia" w:cstheme="majorBidi"/>
       <w:color w:val="595959" w:themeColor="text1" w:themeTint="A6"/>
@@ -1590,7 +1590,7 @@
     <w:link w:val="QuoteChar"/>
     <w:uiPriority w:val="29"/>
     <w:qFormat/>
-    <w:rsid w:val="00456B15"/>
+    <w:rsid w:val="00F44AAA"/>
     <w:pPr>
       <w:spacing w:before="160"/>
       <w:jc w:val="center"/>
@@ -1606,7 +1606,7 @@
     <w:basedOn w:val="DefaultParagraphFont"/>
     <w:link w:val="Quote"/>
     <w:uiPriority w:val="29"/>
-    <w:rsid w:val="00456B15"/>
+    <w:rsid w:val="00F44AAA"/>
     <w:rPr>
       <w:i/>
       <w:iCs/>
@@ -1619,7 +1619,7 @@
     <w:basedOn w:val="Normal"/>
     <w:uiPriority w:val="34"/>
     <w:qFormat/>
-    <w:rsid w:val="00456B15"/>
+    <w:rsid w:val="00F44AAA"/>
     <w:pPr>
       <w:ind w:left="720"/>
       <w:contextualSpacing/>
@@ -1630,7 +1630,7 @@
     <w:basedOn w:val="DefaultParagraphFont"/>
     <w:uiPriority w:val="21"/>
     <w:qFormat/>
-    <w:rsid w:val="00456B15"/>
+    <w:rsid w:val="00F44AAA"/>
     <w:rPr>
       <w:i/>
       <w:iCs/>
@@ -1644,7 +1644,7 @@
     <w:link w:val="IntenseQuoteChar"/>
     <w:uiPriority w:val="30"/>
     <w:qFormat/>
-    <w:rsid w:val="00456B15"/>
+    <w:rsid w:val="00F44AAA"/>
     <w:pPr>
       <w:pBdr>
         <w:top w:val="single" w:sz="4" w:space="10" w:color="0F4761" w:themeColor="accent1" w:themeShade="BF"/>
@@ -1665,7 +1665,7 @@
     <w:basedOn w:val="DefaultParagraphFont"/>
     <w:link w:val="IntenseQuote"/>
     <w:uiPriority w:val="30"/>
-    <w:rsid w:val="00456B15"/>
+    <w:rsid w:val="00F44AAA"/>
     <w:rPr>
       <w:i/>
       <w:iCs/>
@@ -1678,7 +1678,7 @@
     <w:basedOn w:val="DefaultParagraphFont"/>
     <w:uiPriority w:val="32"/>
     <w:qFormat/>
-    <w:rsid w:val="00456B15"/>
+    <w:rsid w:val="00F44AAA"/>
     <w:rPr>
       <w:b/>
       <w:bCs/>
@@ -1693,7 +1693,7 @@
     <w:link w:val="HeaderChar"/>
     <w:uiPriority w:val="99"/>
     <w:unhideWhenUsed/>
-    <w:rsid w:val="00456B15"/>
+    <w:rsid w:val="00F44AAA"/>
     <w:pPr>
       <w:tabs>
         <w:tab w:val="center" w:pos="4513"/>
@@ -1707,7 +1707,7 @@
     <w:basedOn w:val="DefaultParagraphFont"/>
     <w:link w:val="Header"/>
     <w:uiPriority w:val="99"/>
-    <w:rsid w:val="00456B15"/>
+    <w:rsid w:val="00F44AAA"/>
     <w:rPr>
       <w:lang w:val="en-US"/>
     </w:rPr>
@@ -1718,7 +1718,7 @@
     <w:link w:val="FooterChar"/>
     <w:uiPriority w:val="99"/>
     <w:unhideWhenUsed/>
-    <w:rsid w:val="00456B15"/>
+    <w:rsid w:val="00F44AAA"/>
     <w:pPr>
       <w:tabs>
         <w:tab w:val="center" w:pos="4513"/>
@@ -1732,7 +1732,7 @@
     <w:basedOn w:val="DefaultParagraphFont"/>
     <w:link w:val="Footer"/>
     <w:uiPriority w:val="99"/>
-    <w:rsid w:val="00456B15"/>
+    <w:rsid w:val="00F44AAA"/>
     <w:rPr>
       <w:lang w:val="en-US"/>
     </w:rPr>

</xml_diff>

<commit_message>
Vervang aansoek@hetjan.org met navrae@hetjan.org deurgaans
Co-Authored-By: Claude Fable 5 <noreply@anthropic.com>
</commit_message>
<xml_diff>
--- a/dokumente/HJMF-terugvoerverslag-templaat.docx
+++ b/dokumente/HJMF-terugvoerverslag-templaat.docx
@@ -11,10 +11,10 @@
           <w:noProof/>
         </w:rPr>
         <w:drawing>
-          <wp:inline distT="0" distB="0" distL="0" distR="0" wp14:anchorId="556FEF22" wp14:editId="7FA39DEB">
+          <wp:inline distT="0" distB="0" distL="0" distR="0" wp14:anchorId="1E6AE1E9" wp14:editId="070412B5">
             <wp:extent cx="1512000" cy="1088278"/>
             <wp:effectExtent l="0" t="0" r="0" b="0"/>
-            <wp:docPr id="597874614" name="Picture 1"/>
+            <wp:docPr id="1166502798" name="Picture 1"/>
             <wp:cNvGraphicFramePr>
               <a:graphicFrameLocks xmlns:a="http://schemas.openxmlformats.org/drawingml/2006/main" noChangeAspect="1"/>
             </wp:cNvGraphicFramePr>
@@ -22,7 +22,7 @@
               <a:graphicData uri="http://schemas.openxmlformats.org/drawingml/2006/picture">
                 <pic:pic xmlns:pic="http://schemas.openxmlformats.org/drawingml/2006/picture">
                   <pic:nvPicPr>
-                    <pic:cNvPr id="597874614" name=""/>
+                    <pic:cNvPr id="1166502798" name=""/>
                     <pic:cNvPicPr/>
                   </pic:nvPicPr>
                   <pic:blipFill>
@@ -683,7 +683,7 @@
         <w:color w:val="5C6F6A"/>
         <w:sz w:val="17"/>
       </w:rPr>
-      <w:t>Het Jan Marais Fonds · aansoek@hetjan.org · Openbare weldaadsorganisasie 930085957</w:t>
+      <w:t>Het Jan Marais Fonds · navrae@hetjan.org · Openbare weldaadsorganisasie 930085957</w:t>
     </w:r>
   </w:p>
 </w:ftr>
@@ -1165,7 +1165,7 @@
     <w:link w:val="Heading1Char"/>
     <w:uiPriority w:val="9"/>
     <w:qFormat/>
-    <w:rsid w:val="00F44AAA"/>
+    <w:rsid w:val="00B63596"/>
     <w:pPr>
       <w:keepNext/>
       <w:keepLines/>
@@ -1188,7 +1188,7 @@
     <w:semiHidden/>
     <w:unhideWhenUsed/>
     <w:qFormat/>
-    <w:rsid w:val="00F44AAA"/>
+    <w:rsid w:val="00B63596"/>
     <w:pPr>
       <w:keepNext/>
       <w:keepLines/>
@@ -1211,7 +1211,7 @@
     <w:semiHidden/>
     <w:unhideWhenUsed/>
     <w:qFormat/>
-    <w:rsid w:val="00F44AAA"/>
+    <w:rsid w:val="00B63596"/>
     <w:pPr>
       <w:keepNext/>
       <w:keepLines/>
@@ -1234,7 +1234,7 @@
     <w:semiHidden/>
     <w:unhideWhenUsed/>
     <w:qFormat/>
-    <w:rsid w:val="00F44AAA"/>
+    <w:rsid w:val="00B63596"/>
     <w:pPr>
       <w:keepNext/>
       <w:keepLines/>
@@ -1257,7 +1257,7 @@
     <w:semiHidden/>
     <w:unhideWhenUsed/>
     <w:qFormat/>
-    <w:rsid w:val="00F44AAA"/>
+    <w:rsid w:val="00B63596"/>
     <w:pPr>
       <w:keepNext/>
       <w:keepLines/>
@@ -1278,7 +1278,7 @@
     <w:semiHidden/>
     <w:unhideWhenUsed/>
     <w:qFormat/>
-    <w:rsid w:val="00F44AAA"/>
+    <w:rsid w:val="00B63596"/>
     <w:pPr>
       <w:keepNext/>
       <w:keepLines/>
@@ -1301,7 +1301,7 @@
     <w:semiHidden/>
     <w:unhideWhenUsed/>
     <w:qFormat/>
-    <w:rsid w:val="00F44AAA"/>
+    <w:rsid w:val="00B63596"/>
     <w:pPr>
       <w:keepNext/>
       <w:keepLines/>
@@ -1322,7 +1322,7 @@
     <w:semiHidden/>
     <w:unhideWhenUsed/>
     <w:qFormat/>
-    <w:rsid w:val="00F44AAA"/>
+    <w:rsid w:val="00B63596"/>
     <w:pPr>
       <w:keepNext/>
       <w:keepLines/>
@@ -1345,7 +1345,7 @@
     <w:semiHidden/>
     <w:unhideWhenUsed/>
     <w:qFormat/>
-    <w:rsid w:val="00F44AAA"/>
+    <w:rsid w:val="00B63596"/>
     <w:pPr>
       <w:keepNext/>
       <w:keepLines/>
@@ -1389,7 +1389,7 @@
     <w:basedOn w:val="DefaultParagraphFont"/>
     <w:link w:val="Heading1"/>
     <w:uiPriority w:val="9"/>
-    <w:rsid w:val="00F44AAA"/>
+    <w:rsid w:val="00B63596"/>
     <w:rPr>
       <w:rFonts w:asciiTheme="majorHAnsi" w:eastAsiaTheme="majorEastAsia" w:hAnsiTheme="majorHAnsi" w:cstheme="majorBidi"/>
       <w:color w:val="0F4761" w:themeColor="accent1" w:themeShade="BF"/>
@@ -1404,7 +1404,7 @@
     <w:link w:val="Heading2"/>
     <w:uiPriority w:val="9"/>
     <w:semiHidden/>
-    <w:rsid w:val="00F44AAA"/>
+    <w:rsid w:val="00B63596"/>
     <w:rPr>
       <w:rFonts w:asciiTheme="majorHAnsi" w:eastAsiaTheme="majorEastAsia" w:hAnsiTheme="majorHAnsi" w:cstheme="majorBidi"/>
       <w:color w:val="0F4761" w:themeColor="accent1" w:themeShade="BF"/>
@@ -1419,7 +1419,7 @@
     <w:link w:val="Heading3"/>
     <w:uiPriority w:val="9"/>
     <w:semiHidden/>
-    <w:rsid w:val="00F44AAA"/>
+    <w:rsid w:val="00B63596"/>
     <w:rPr>
       <w:rFonts w:eastAsiaTheme="majorEastAsia" w:cstheme="majorBidi"/>
       <w:color w:val="0F4761" w:themeColor="accent1" w:themeShade="BF"/>
@@ -1434,7 +1434,7 @@
     <w:link w:val="Heading4"/>
     <w:uiPriority w:val="9"/>
     <w:semiHidden/>
-    <w:rsid w:val="00F44AAA"/>
+    <w:rsid w:val="00B63596"/>
     <w:rPr>
       <w:rFonts w:eastAsiaTheme="majorEastAsia" w:cstheme="majorBidi"/>
       <w:i/>
@@ -1449,7 +1449,7 @@
     <w:link w:val="Heading5"/>
     <w:uiPriority w:val="9"/>
     <w:semiHidden/>
-    <w:rsid w:val="00F44AAA"/>
+    <w:rsid w:val="00B63596"/>
     <w:rPr>
       <w:rFonts w:eastAsiaTheme="majorEastAsia" w:cstheme="majorBidi"/>
       <w:color w:val="0F4761" w:themeColor="accent1" w:themeShade="BF"/>
@@ -1462,7 +1462,7 @@
     <w:link w:val="Heading6"/>
     <w:uiPriority w:val="9"/>
     <w:semiHidden/>
-    <w:rsid w:val="00F44AAA"/>
+    <w:rsid w:val="00B63596"/>
     <w:rPr>
       <w:rFonts w:eastAsiaTheme="majorEastAsia" w:cstheme="majorBidi"/>
       <w:i/>
@@ -1477,7 +1477,7 @@
     <w:link w:val="Heading7"/>
     <w:uiPriority w:val="9"/>
     <w:semiHidden/>
-    <w:rsid w:val="00F44AAA"/>
+    <w:rsid w:val="00B63596"/>
     <w:rPr>
       <w:rFonts w:eastAsiaTheme="majorEastAsia" w:cstheme="majorBidi"/>
       <w:color w:val="595959" w:themeColor="text1" w:themeTint="A6"/>
@@ -1490,7 +1490,7 @@
     <w:link w:val="Heading8"/>
     <w:uiPriority w:val="9"/>
     <w:semiHidden/>
-    <w:rsid w:val="00F44AAA"/>
+    <w:rsid w:val="00B63596"/>
     <w:rPr>
       <w:rFonts w:eastAsiaTheme="majorEastAsia" w:cstheme="majorBidi"/>
       <w:i/>
@@ -1505,7 +1505,7 @@
     <w:link w:val="Heading9"/>
     <w:uiPriority w:val="9"/>
     <w:semiHidden/>
-    <w:rsid w:val="00F44AAA"/>
+    <w:rsid w:val="00B63596"/>
     <w:rPr>
       <w:rFonts w:eastAsiaTheme="majorEastAsia" w:cstheme="majorBidi"/>
       <w:color w:val="272727" w:themeColor="text1" w:themeTint="D8"/>
@@ -1519,7 +1519,7 @@
     <w:link w:val="TitleChar"/>
     <w:uiPriority w:val="10"/>
     <w:qFormat/>
-    <w:rsid w:val="00F44AAA"/>
+    <w:rsid w:val="00B63596"/>
     <w:pPr>
       <w:spacing w:after="80" w:line="240" w:lineRule="auto"/>
       <w:contextualSpacing/>
@@ -1537,7 +1537,7 @@
     <w:basedOn w:val="DefaultParagraphFont"/>
     <w:link w:val="Title"/>
     <w:uiPriority w:val="10"/>
-    <w:rsid w:val="00F44AAA"/>
+    <w:rsid w:val="00B63596"/>
     <w:rPr>
       <w:rFonts w:asciiTheme="majorHAnsi" w:eastAsiaTheme="majorEastAsia" w:hAnsiTheme="majorHAnsi" w:cstheme="majorBidi"/>
       <w:spacing w:val="-10"/>
@@ -1554,7 +1554,7 @@
     <w:link w:val="SubtitleChar"/>
     <w:uiPriority w:val="11"/>
     <w:qFormat/>
-    <w:rsid w:val="00F44AAA"/>
+    <w:rsid w:val="00B63596"/>
     <w:pPr>
       <w:numPr>
         <w:ilvl w:val="1"/>
@@ -1573,7 +1573,7 @@
     <w:basedOn w:val="DefaultParagraphFont"/>
     <w:link w:val="Subtitle"/>
     <w:uiPriority w:val="11"/>
-    <w:rsid w:val="00F44AAA"/>
+    <w:rsid w:val="00B63596"/>
     <w:rPr>
       <w:rFonts w:eastAsiaTheme="majorEastAsia" w:cstheme="majorBidi"/>
       <w:color w:val="595959" w:themeColor="text1" w:themeTint="A6"/>
@@ -1590,7 +1590,7 @@
     <w:link w:val="QuoteChar"/>
     <w:uiPriority w:val="29"/>
     <w:qFormat/>
-    <w:rsid w:val="00F44AAA"/>
+    <w:rsid w:val="00B63596"/>
     <w:pPr>
       <w:spacing w:before="160"/>
       <w:jc w:val="center"/>
@@ -1606,7 +1606,7 @@
     <w:basedOn w:val="DefaultParagraphFont"/>
     <w:link w:val="Quote"/>
     <w:uiPriority w:val="29"/>
-    <w:rsid w:val="00F44AAA"/>
+    <w:rsid w:val="00B63596"/>
     <w:rPr>
       <w:i/>
       <w:iCs/>
@@ -1619,7 +1619,7 @@
     <w:basedOn w:val="Normal"/>
     <w:uiPriority w:val="34"/>
     <w:qFormat/>
-    <w:rsid w:val="00F44AAA"/>
+    <w:rsid w:val="00B63596"/>
     <w:pPr>
       <w:ind w:left="720"/>
       <w:contextualSpacing/>
@@ -1630,7 +1630,7 @@
     <w:basedOn w:val="DefaultParagraphFont"/>
     <w:uiPriority w:val="21"/>
     <w:qFormat/>
-    <w:rsid w:val="00F44AAA"/>
+    <w:rsid w:val="00B63596"/>
     <w:rPr>
       <w:i/>
       <w:iCs/>
@@ -1644,7 +1644,7 @@
     <w:link w:val="IntenseQuoteChar"/>
     <w:uiPriority w:val="30"/>
     <w:qFormat/>
-    <w:rsid w:val="00F44AAA"/>
+    <w:rsid w:val="00B63596"/>
     <w:pPr>
       <w:pBdr>
         <w:top w:val="single" w:sz="4" w:space="10" w:color="0F4761" w:themeColor="accent1" w:themeShade="BF"/>
@@ -1665,7 +1665,7 @@
     <w:basedOn w:val="DefaultParagraphFont"/>
     <w:link w:val="IntenseQuote"/>
     <w:uiPriority w:val="30"/>
-    <w:rsid w:val="00F44AAA"/>
+    <w:rsid w:val="00B63596"/>
     <w:rPr>
       <w:i/>
       <w:iCs/>
@@ -1678,7 +1678,7 @@
     <w:basedOn w:val="DefaultParagraphFont"/>
     <w:uiPriority w:val="32"/>
     <w:qFormat/>
-    <w:rsid w:val="00F44AAA"/>
+    <w:rsid w:val="00B63596"/>
     <w:rPr>
       <w:b/>
       <w:bCs/>
@@ -1693,7 +1693,7 @@
     <w:link w:val="HeaderChar"/>
     <w:uiPriority w:val="99"/>
     <w:unhideWhenUsed/>
-    <w:rsid w:val="00F44AAA"/>
+    <w:rsid w:val="00B63596"/>
     <w:pPr>
       <w:tabs>
         <w:tab w:val="center" w:pos="4513"/>
@@ -1707,7 +1707,7 @@
     <w:basedOn w:val="DefaultParagraphFont"/>
     <w:link w:val="Header"/>
     <w:uiPriority w:val="99"/>
-    <w:rsid w:val="00F44AAA"/>
+    <w:rsid w:val="00B63596"/>
     <w:rPr>
       <w:lang w:val="en-US"/>
     </w:rPr>
@@ -1718,7 +1718,7 @@
     <w:link w:val="FooterChar"/>
     <w:uiPriority w:val="99"/>
     <w:unhideWhenUsed/>
-    <w:rsid w:val="00F44AAA"/>
+    <w:rsid w:val="00B63596"/>
     <w:pPr>
       <w:tabs>
         <w:tab w:val="center" w:pos="4513"/>
@@ -1732,7 +1732,7 @@
     <w:basedOn w:val="DefaultParagraphFont"/>
     <w:link w:val="Footer"/>
     <w:uiPriority w:val="99"/>
-    <w:rsid w:val="00F44AAA"/>
+    <w:rsid w:val="00B63596"/>
     <w:rPr>
       <w:lang w:val="en-US"/>
     </w:rPr>

</xml_diff>